<commit_message>
docs: tighten interim report to v1.1 (remove duplicated sections, add charging interaction)
Co-Authored-By: Claude Opus 5.5 <noreply@anthropic.com>
Claude-Session: https://claude.ai/code/session_01Qz3Pq1XT4GoX9UD7qvXAd4
</commit_message>
<xml_diff>
--- a/docs/13_PRISM-Hub_중간보고서_최종본.docx
+++ b/docs/13_PRISM-Hub_중간보고서_최종본.docx
@@ -115,7 +115,7 @@
                 <w:sz w:val="19"/>
                 <w:szCs w:val="19"/>
               </w:rPr>
-              <w:t xml:space="preserve">중간 연구 진행 보고서(제출본, v1.0)</w:t>
+              <w:t xml:space="preserve">중간 연구 진행 보고서(최종본, v1.1)</w:t>
             </w:r>
           </w:p>
         </w:tc>
@@ -339,7 +339,7 @@
                 <w:sz w:val="19"/>
                 <w:szCs w:val="19"/>
               </w:rPr>
-              <w:t xml:space="preserve">2026년 9월 25일</w:t>
+              <w:t xml:space="preserve">2026년 9월 28일</w:t>
             </w:r>
           </w:p>
         </w:tc>
@@ -451,7 +451,7 @@
                 <w:sz w:val="19"/>
                 <w:szCs w:val="19"/>
               </w:rPr>
-              <w:t xml:space="preserve">태그 v1.0-interim(커밋 add4822). 본 보고서의 추가 분석(6.4·6.6·6.8·6.9절, 그림 2·5·7·8)은 validation/2026-09-25-final-report/에 수록하며 저장소에 함께 반영한다.</w:t>
+              <w:t xml:space="preserve">태그 v1.0-interim(커밋 add4822). 본 보고서의 추가 분석(3.4·6.4·6.6·6.8절, 그림 2·5·7·8)은 validation/2026-09-25-final-report/에 수록했다.</w:t>
             </w:r>
           </w:p>
         </w:tc>
@@ -785,7 +785,7 @@
             <w:tab/>
           </w:r>
           <w:r>
-            <w:t>8</w:t>
+            <w:t>7</w:t>
           </w:r>
         </w:p>
         <w:p>
@@ -802,7 +802,7 @@
             <w:tab/>
           </w:r>
           <w:r>
-            <w:t>8</w:t>
+            <w:t>7</w:t>
           </w:r>
         </w:p>
         <w:p>
@@ -836,7 +836,7 @@
             <w:tab/>
           </w:r>
           <w:r>
-            <w:t>9</w:t>
+            <w:t>8</w:t>
           </w:r>
         </w:p>
         <w:p>
@@ -853,7 +853,7 @@
             <w:tab/>
           </w:r>
           <w:r>
-            <w:t>10</w:t>
+            <w:t>9</w:t>
           </w:r>
         </w:p>
         <w:p>
@@ -870,7 +870,7 @@
             <w:tab/>
           </w:r>
           <w:r>
-            <w:t>10</w:t>
+            <w:t>9</w:t>
           </w:r>
         </w:p>
         <w:p>
@@ -887,7 +887,7 @@
             <w:tab/>
           </w:r>
           <w:r>
-            <w:t>10</w:t>
+            <w:t>9</w:t>
           </w:r>
         </w:p>
         <w:p>
@@ -921,7 +921,7 @@
             <w:tab/>
           </w:r>
           <w:r>
-            <w:t>11</w:t>
+            <w:t>10</w:t>
           </w:r>
         </w:p>
         <w:p>
@@ -938,7 +938,7 @@
             <w:tab/>
           </w:r>
           <w:r>
-            <w:t>12</w:t>
+            <w:t>11</w:t>
           </w:r>
         </w:p>
         <w:p>
@@ -955,7 +955,7 @@
             <w:tab/>
           </w:r>
           <w:r>
-            <w:t>13</w:t>
+            <w:t>12</w:t>
           </w:r>
         </w:p>
         <w:p>
@@ -972,7 +972,7 @@
             <w:tab/>
           </w:r>
           <w:r>
-            <w:t>13</w:t>
+            <w:t>12</w:t>
           </w:r>
         </w:p>
         <w:p>
@@ -1000,7 +1000,7 @@
             </w:tabs>
           </w:pPr>
           <w:r>
-            <w:t xml:space="preserve">4.1 전체 구성</w:t>
+            <w:t xml:space="preserve">4.1 Stage A: 2:1 고정비 대전력 경로</w:t>
           </w:r>
           <w:r>
             <w:tab/>
@@ -1017,7 +1017,7 @@
             </w:tabs>
           </w:pPr>
           <w:r>
-            <w:t xml:space="preserve">4.2 Stage A: 2:1 고정비 대전력 경로</w:t>
+            <w:t xml:space="preserve">4.2 Stage B: 유한 링크 2단 부분전력 조정기</w:t>
           </w:r>
           <w:r>
             <w:tab/>
@@ -1034,7 +1034,7 @@
             </w:tabs>
           </w:pPr>
           <w:r>
-            <w:t xml:space="preserve">4.3 Stage B: 유한 링크 2단 부분전력 조정기</w:t>
+            <w:t xml:space="preserve">4.3 Stage C: 48 V 및 12 V 절연 전원</w:t>
           </w:r>
           <w:r>
             <w:tab/>
@@ -1051,7 +1051,41 @@
             </w:tabs>
           </w:pPr>
           <w:r>
-            <w:t xml:space="preserve">4.4 Stage C: 48 V 및 12 V 절연 전원</w:t>
+            <w:t xml:space="preserve">4.4 SALS: 포화 인지형 부하 승인 계층</w:t>
+          </w:r>
+          <w:r>
+            <w:tab/>
+          </w:r>
+          <w:r>
+            <w:t>14</w:t>
+          </w:r>
+        </w:p>
+        <w:p>
+          <w:pPr>
+            <w:pStyle w:val="TOC2"/>
+            <w:tabs>
+              <w:tab w:val="right" w:leader="dot" w:pos="9016"/>
+            </w:tabs>
+          </w:pPr>
+          <w:r>
+            <w:t xml:space="preserve">4.5 주요 운전 모드</w:t>
+          </w:r>
+          <w:r>
+            <w:tab/>
+          </w:r>
+          <w:r>
+            <w:t>14</w:t>
+          </w:r>
+        </w:p>
+        <w:p>
+          <w:pPr>
+            <w:pStyle w:val="TOC1"/>
+            <w:tabs>
+              <w:tab w:val="right" w:leader="dot" w:pos="9016"/>
+            </w:tabs>
+          </w:pPr>
+          <w:r>
+            <w:t xml:space="preserve">5. 검증 방법과 진행 상황</w:t>
           </w:r>
           <w:r>
             <w:tab/>
@@ -1068,7 +1102,7 @@
             </w:tabs>
           </w:pPr>
           <w:r>
-            <w:t xml:space="preserve">4.5 SALS: 포화 인지형 부하 승인 계층</w:t>
+            <w:t xml:space="preserve">5.1 검증 원칙과 모델</w:t>
           </w:r>
           <w:r>
             <w:tab/>
@@ -1085,7 +1119,7 @@
             </w:tabs>
           </w:pPr>
           <w:r>
-            <w:t xml:space="preserve">4.6 주요 운전 모드</w:t>
+            <w:t xml:space="preserve">5.2 초기 모델의 문제와 보완</w:t>
           </w:r>
           <w:r>
             <w:tab/>
@@ -1096,13 +1130,30 @@
         </w:p>
         <w:p>
           <w:pPr>
+            <w:pStyle w:val="TOC2"/>
+            <w:tabs>
+              <w:tab w:val="right" w:leader="dot" w:pos="9016"/>
+            </w:tabs>
+          </w:pPr>
+          <w:r>
+            <w:t xml:space="preserve">5.3 판정 기준과 지연 모델</w:t>
+          </w:r>
+          <w:r>
+            <w:tab/>
+          </w:r>
+          <w:r>
+            <w:t>16</w:t>
+          </w:r>
+        </w:p>
+        <w:p>
+          <w:pPr>
             <w:pStyle w:val="TOC1"/>
             <w:tabs>
               <w:tab w:val="right" w:leader="dot" w:pos="9016"/>
             </w:tabs>
           </w:pPr>
           <w:r>
-            <w:t xml:space="preserve">5. 검증 방법과 진행 상황</w:t>
+            <w:t xml:space="preserve">6. 검증 결과 및 공학적 분석</w:t>
           </w:r>
           <w:r>
             <w:tab/>
@@ -1119,7 +1170,7 @@
             </w:tabs>
           </w:pPr>
           <w:r>
-            <w:t xml:space="preserve">5.1 검증 원칙과 모델</w:t>
+            <w:t xml:space="preserve">6.1 모델 내부 정합성</w:t>
           </w:r>
           <w:r>
             <w:tab/>
@@ -1136,7 +1187,7 @@
             </w:tabs>
           </w:pPr>
           <w:r>
-            <w:t xml:space="preserve">5.2 초기 모델의 문제와 보완</w:t>
+            <w:t xml:space="preserve">6.2 초기 2단 모델의 동적 시험</w:t>
           </w:r>
           <w:r>
             <w:tab/>
@@ -1153,24 +1204,7 @@
             </w:tabs>
           </w:pPr>
           <w:r>
-            <w:t xml:space="preserve">5.3 판정 기준과 지연 모델</w:t>
-          </w:r>
-          <w:r>
-            <w:tab/>
-          </w:r>
-          <w:r>
-            <w:t>17</w:t>
-          </w:r>
-        </w:p>
-        <w:p>
-          <w:pPr>
-            <w:pStyle w:val="TOC1"/>
-            <w:tabs>
-              <w:tab w:val="right" w:leader="dot" w:pos="9016"/>
-            </w:tabs>
-          </w:pPr>
-          <w:r>
-            <w:t xml:space="preserve">6. 검증 결과 및 공학적 분석</w:t>
+            <w:t xml:space="preserve">6.3 공통 고정이득 제어기</w:t>
           </w:r>
           <w:r>
             <w:tab/>
@@ -1187,7 +1221,7 @@
             </w:tabs>
           </w:pPr>
           <w:r>
-            <w:t xml:space="preserve">6.1 모델 내부 정합성</w:t>
+            <w:t xml:space="preserve">6.4 640 V 코너의 여유와 한계의 공통 원인</w:t>
           </w:r>
           <w:r>
             <w:tab/>
@@ -1204,24 +1238,7 @@
             </w:tabs>
           </w:pPr>
           <w:r>
-            <w:t xml:space="preserve">6.2 초기 2단 모델의 동적 시험</w:t>
-          </w:r>
-          <w:r>
-            <w:tab/>
-          </w:r>
-          <w:r>
-            <w:t>17</w:t>
-          </w:r>
-        </w:p>
-        <w:p>
-          <w:pPr>
-            <w:pStyle w:val="TOC2"/>
-            <w:tabs>
-              <w:tab w:val="right" w:leader="dot" w:pos="9016"/>
-            </w:tabs>
-          </w:pPr>
-          <w:r>
-            <w:t xml:space="preserve">6.3 공통 고정이득 제어기</w:t>
+            <w:t xml:space="preserve">6.5 공차와 지연 민감도</w:t>
           </w:r>
           <w:r>
             <w:tab/>
@@ -1238,24 +1255,7 @@
             </w:tabs>
           </w:pPr>
           <w:r>
-            <w:t xml:space="preserve">6.4 640 V 코너의 여유와 한계의 공통 원인</w:t>
-          </w:r>
-          <w:r>
-            <w:tab/>
-          </w:r>
-          <w:r>
-            <w:t>18</w:t>
-          </w:r>
-        </w:p>
-        <w:p>
-          <w:pPr>
-            <w:pStyle w:val="TOC2"/>
-            <w:tabs>
-              <w:tab w:val="right" w:leader="dot" w:pos="9016"/>
-            </w:tabs>
-          </w:pPr>
-          <w:r>
-            <w:t xml:space="preserve">6.5 공차와 지연 민감도</w:t>
+            <w:t xml:space="preserve">6.6 배터리 전압에 따른 과도 허용 전력</w:t>
           </w:r>
           <w:r>
             <w:tab/>
@@ -1272,7 +1272,7 @@
             </w:tabs>
           </w:pPr>
           <w:r>
-            <w:t xml:space="preserve">6.6 배터리 전압에 따른 과도 허용 전력</w:t>
+            <w:t xml:space="preserve">6.7 시험군 요약</w:t>
           </w:r>
           <w:r>
             <w:tab/>
@@ -1289,7 +1289,7 @@
             </w:tabs>
           </w:pPr>
           <w:r>
-            <w:t xml:space="preserve">6.7 시험군 요약</w:t>
+            <w:t xml:space="preserve">6.8 SALS 인과성과 승인 가능조건</w:t>
           </w:r>
           <w:r>
             <w:tab/>
@@ -1300,13 +1300,13 @@
         </w:p>
         <w:p>
           <w:pPr>
-            <w:pStyle w:val="TOC2"/>
+            <w:pStyle w:val="TOC1"/>
             <w:tabs>
               <w:tab w:val="right" w:leader="dot" w:pos="9016"/>
             </w:tabs>
           </w:pPr>
           <w:r>
-            <w:t xml:space="preserve">6.8 Stage B의 처리전력</w:t>
+            <w:t xml:space="preserve">7. 현재까지의 성과, 한계 및 기술 성숙도</w:t>
           </w:r>
           <w:r>
             <w:tab/>
@@ -1323,7 +1323,7 @@
             </w:tabs>
           </w:pPr>
           <w:r>
-            <w:t xml:space="preserve">6.9 SALS 인과성과 승인 가능조건</w:t>
+            <w:t xml:space="preserve">7.1 현재까지 확보한 성과</w:t>
           </w:r>
           <w:r>
             <w:tab/>
@@ -1340,7 +1340,41 @@
             </w:tabs>
           </w:pPr>
           <w:r>
-            <w:t xml:space="preserve">6.10 충전과 Stage C의 검증 상태</w:t>
+            <w:t xml:space="preserve">7.2 남은 한계와 위험</w:t>
+          </w:r>
+          <w:r>
+            <w:tab/>
+          </w:r>
+          <w:r>
+            <w:t>22</w:t>
+          </w:r>
+        </w:p>
+        <w:p>
+          <w:pPr>
+            <w:pStyle w:val="TOC2"/>
+            <w:tabs>
+              <w:tab w:val="right" w:leader="dot" w:pos="9016"/>
+            </w:tabs>
+          </w:pPr>
+          <w:r>
+            <w:t xml:space="preserve">7.3 현재 기술성숙도 판정</w:t>
+          </w:r>
+          <w:r>
+            <w:tab/>
+          </w:r>
+          <w:r>
+            <w:t>22</w:t>
+          </w:r>
+        </w:p>
+        <w:p>
+          <w:pPr>
+            <w:pStyle w:val="TOC2"/>
+            <w:tabs>
+              <w:tab w:val="right" w:leader="dot" w:pos="9016"/>
+            </w:tabs>
+          </w:pPr>
+          <w:r>
+            <w:t xml:space="preserve">7.4 최초 계획 대비 진척</w:t>
           </w:r>
           <w:r>
             <w:tab/>
@@ -1357,7 +1391,7 @@
             </w:tabs>
           </w:pPr>
           <w:r>
-            <w:t xml:space="preserve">7. 현재까지의 성과, 한계 및 기술 성숙도</w:t>
+            <w:t xml:space="preserve">8. 향후 연구 계획</w:t>
           </w:r>
           <w:r>
             <w:tab/>
@@ -1374,7 +1408,7 @@
             </w:tabs>
           </w:pPr>
           <w:r>
-            <w:t xml:space="preserve">7.1 현재까지 확보한 성과</w:t>
+            <w:t xml:space="preserve">8.1 요구사항, 부하 등급과 수락 기준 확정</w:t>
           </w:r>
           <w:r>
             <w:tab/>
@@ -1391,24 +1425,7 @@
             </w:tabs>
           </w:pPr>
           <w:r>
-            <w:t xml:space="preserve">7.2 남은 한계와 위험</w:t>
-          </w:r>
-          <w:r>
-            <w:tab/>
-          </w:r>
-          <w:r>
-            <w:t>23</w:t>
-          </w:r>
-        </w:p>
-        <w:p>
-          <w:pPr>
-            <w:pStyle w:val="TOC2"/>
-            <w:tabs>
-              <w:tab w:val="right" w:leader="dot" w:pos="9016"/>
-            </w:tabs>
-          </w:pPr>
-          <w:r>
-            <w:t xml:space="preserve">7.3 현재 기술성숙도 판정</w:t>
+            <w:t xml:space="preserve">8.2 Stage B 스위칭 회로와 부품 설계</w:t>
           </w:r>
           <w:r>
             <w:tab/>
@@ -1425,7 +1442,7 @@
             </w:tabs>
           </w:pPr>
           <w:r>
-            <w:t xml:space="preserve">7.4 최초 계획 대비 진척</w:t>
+            <w:t xml:space="preserve">8.3 공통 제어기의 강건성 확보</w:t>
           </w:r>
           <w:r>
             <w:tab/>
@@ -1436,13 +1453,47 @@
         </w:p>
         <w:p>
           <w:pPr>
-            <w:pStyle w:val="TOC1"/>
+            <w:pStyle w:val="TOC2"/>
             <w:tabs>
               <w:tab w:val="right" w:leader="dot" w:pos="9016"/>
             </w:tabs>
           </w:pPr>
           <w:r>
-            <w:t xml:space="preserve">8. 향후 연구 계획</w:t>
+            <w:t xml:space="preserve">8.4 충전과 보조전원의 통합 검증</w:t>
+          </w:r>
+          <w:r>
+            <w:tab/>
+          </w:r>
+          <w:r>
+            <w:t>24</w:t>
+          </w:r>
+        </w:p>
+        <w:p>
+          <w:pPr>
+            <w:pStyle w:val="TOC2"/>
+            <w:tabs>
+              <w:tab w:val="right" w:leader="dot" w:pos="9016"/>
+            </w:tabs>
+          </w:pPr>
+          <w:r>
+            <w:t xml:space="preserve">8.5 Stage C 5 kW 재설계</w:t>
+          </w:r>
+          <w:r>
+            <w:tab/>
+          </w:r>
+          <w:r>
+            <w:t>24</w:t>
+          </w:r>
+        </w:p>
+        <w:p>
+          <w:pPr>
+            <w:pStyle w:val="TOC2"/>
+            <w:tabs>
+              <w:tab w:val="right" w:leader="dot" w:pos="9016"/>
+            </w:tabs>
+          </w:pPr>
+          <w:r>
+            <w:t xml:space="preserve">8.6 SALS의 인과적 구현과 서비스 평가</w:t>
           </w:r>
           <w:r>
             <w:tab/>
@@ -1459,7 +1510,7 @@
             </w:tabs>
           </w:pPr>
           <w:r>
-            <w:t xml:space="preserve">8.1 요구사항, 부하 등급과 수락 기준 확정</w:t>
+            <w:t xml:space="preserve">8.7 기준 구조 비교, 신규성 검증과 하드웨어 실증</w:t>
           </w:r>
           <w:r>
             <w:tab/>
@@ -1476,7 +1527,7 @@
             </w:tabs>
           </w:pPr>
           <w:r>
-            <w:t xml:space="preserve">8.2 Stage B 스위칭 회로와 부품 설계</w:t>
+            <w:t xml:space="preserve">8.8 남은 기간의 우선순위와 일정</w:t>
           </w:r>
           <w:r>
             <w:tab/>
@@ -1487,98 +1538,13 @@
         </w:p>
         <w:p>
           <w:pPr>
-            <w:pStyle w:val="TOC2"/>
+            <w:pStyle w:val="TOC1"/>
             <w:tabs>
               <w:tab w:val="right" w:leader="dot" w:pos="9016"/>
             </w:tabs>
           </w:pPr>
           <w:r>
-            <w:t xml:space="preserve">8.3 공통 제어기의 강건성 확보</w:t>
-          </w:r>
-          <w:r>
-            <w:tab/>
-          </w:r>
-          <w:r>
-            <w:t>25</w:t>
-          </w:r>
-        </w:p>
-        <w:p>
-          <w:pPr>
-            <w:pStyle w:val="TOC2"/>
-            <w:tabs>
-              <w:tab w:val="right" w:leader="dot" w:pos="9016"/>
-            </w:tabs>
-          </w:pPr>
-          <w:r>
-            <w:t xml:space="preserve">8.4 충전과 보조전원의 통합 검증</w:t>
-          </w:r>
-          <w:r>
-            <w:tab/>
-          </w:r>
-          <w:r>
-            <w:t>26</w:t>
-          </w:r>
-        </w:p>
-        <w:p>
-          <w:pPr>
-            <w:pStyle w:val="TOC2"/>
-            <w:tabs>
-              <w:tab w:val="right" w:leader="dot" w:pos="9016"/>
-            </w:tabs>
-          </w:pPr>
-          <w:r>
-            <w:t xml:space="preserve">8.5 Stage C 5 kW 재설계</w:t>
-          </w:r>
-          <w:r>
-            <w:tab/>
-          </w:r>
-          <w:r>
-            <w:t>26</w:t>
-          </w:r>
-        </w:p>
-        <w:p>
-          <w:pPr>
-            <w:pStyle w:val="TOC2"/>
-            <w:tabs>
-              <w:tab w:val="right" w:leader="dot" w:pos="9016"/>
-            </w:tabs>
-          </w:pPr>
-          <w:r>
-            <w:t xml:space="preserve">8.6 SALS의 인과적 구현과 서비스 평가</w:t>
-          </w:r>
-          <w:r>
-            <w:tab/>
-          </w:r>
-          <w:r>
-            <w:t>26</w:t>
-          </w:r>
-        </w:p>
-        <w:p>
-          <w:pPr>
-            <w:pStyle w:val="TOC2"/>
-            <w:tabs>
-              <w:tab w:val="right" w:leader="dot" w:pos="9016"/>
-            </w:tabs>
-          </w:pPr>
-          <w:r>
-            <w:t xml:space="preserve">8.7 기준 구조 비교, 신규성 검증과 하드웨어 실증</w:t>
-          </w:r>
-          <w:r>
-            <w:tab/>
-          </w:r>
-          <w:r>
-            <w:t>26</w:t>
-          </w:r>
-        </w:p>
-        <w:p>
-          <w:pPr>
-            <w:pStyle w:val="TOC2"/>
-            <w:tabs>
-              <w:tab w:val="right" w:leader="dot" w:pos="9016"/>
-            </w:tabs>
-          </w:pPr>
-          <w:r>
-            <w:t xml:space="preserve">8.8 남은 기간의 우선순위와 일정</w:t>
+            <w:t xml:space="preserve">9. 결론</w:t>
           </w:r>
           <w:r>
             <w:tab/>
@@ -1595,7 +1561,7 @@
             </w:tabs>
           </w:pPr>
           <w:r>
-            <w:t xml:space="preserve">9. 결론</w:t>
+            <w:t xml:space="preserve">부록 A. 주요 약어 및 용어</w:t>
           </w:r>
           <w:r>
             <w:tab/>
@@ -1612,30 +1578,13 @@
             </w:tabs>
           </w:pPr>
           <w:r>
-            <w:t xml:space="preserve">부록 A. 주요 약어 및 용어</w:t>
-          </w:r>
-          <w:r>
-            <w:tab/>
-          </w:r>
-          <w:r>
-            <w:t>28</w:t>
-          </w:r>
-        </w:p>
-        <w:p>
-          <w:pPr>
-            <w:pStyle w:val="TOC1"/>
-            <w:tabs>
-              <w:tab w:val="right" w:leader="dot" w:pos="9016"/>
-            </w:tabs>
-          </w:pPr>
-          <w:r>
             <w:t xml:space="preserve">부록 B. 참고문헌</w:t>
           </w:r>
           <w:r>
             <w:tab/>
           </w:r>
           <w:r>
-            <w:t>28</w:t>
+            <w:t>27</w:t>
           </w:r>
         </w:p>
         <w:p>
@@ -1652,7 +1601,7 @@
             <w:tab/>
           </w:r>
           <w:r>
-            <w:t>30</w:t>
+            <w:t>29</w:t>
           </w:r>
         </w:p>
         <w:p>
@@ -2030,77 +1979,87 @@
         <w:jc w:val="both"/>
       </w:pPr>
       <w:r>
-        <w:t xml:space="preserve">이 질문에 대응하는 프로젝트 목적은 다음과 같다.</w:t>
-      </w:r>
-    </w:p>
-    <w:p>
-      <w:pPr>
-        <w:pStyle w:val="ListParagraph"/>
-        <w:numPr>
-          <w:ilvl w:val="0"/>
-          <w:numId w:val="2"/>
-        </w:numPr>
-        <w:spacing w:after="60"/>
+        <w:t xml:space="preserve">이번 18주 단계의 범위는 MATLAB/Simulink와 Python 교차 구현을 이용한 시뮬레이션 기반 검증이다. 제어기 하드웨어 연동(HIL)과 시제품 실증은 이 단계의 결과로 가설이 유지될 때 후속 단계에서 수행한다.</w:t>
+      </w:r>
+    </w:p>
+    <w:p>
+      <w:pPr>
+        <w:pStyle w:val="Heading1"/>
+      </w:pPr>
+      <w:r>
+        <w:t xml:space="preserve">2. 선행연구 및 유사 기술 분석</w:t>
+      </w:r>
+    </w:p>
+    <w:p>
+      <w:pPr>
+        <w:pStyle w:val="Heading2"/>
+      </w:pPr>
+      <w:r>
+        <w:t xml:space="preserve">2.1 고정비 공진형 스위치드 커패시터 변환</w:t>
+      </w:r>
+    </w:p>
+    <w:p>
+      <w:pPr>
         <w:jc w:val="both"/>
       </w:pPr>
       <w:r>
-        <w:t xml:space="preserve">150 kW급 충전 주경로를 Stage B에서 분리하면서도 충전 중 400 V 보조버스를 조정할 수 있는 노드 구성과 모드 전환 조건을 확립한다.</w:t>
-      </w:r>
-    </w:p>
-    <w:p>
-      <w:pPr>
-        <w:pStyle w:val="ListParagraph"/>
-        <w:numPr>
-          <w:ilvl w:val="0"/>
-          <w:numId w:val="2"/>
-        </w:numPr>
-        <w:spacing w:after="60"/>
+        <w:t xml:space="preserve">공진형 스위치드 커패시터 또는 스위치드 탱크 변환기(Switched-Tank Converter, STC)는 커패시터 연결 상태와 공진전류를 이용해 정해진 비율로 전압을 바꾸며, 공진전류가 0에 가까울 때 스위치를 전환하는 영전류 스위칭(Zero-Current Switching, ZCS)으로 스위칭 손실을 줄인다. Ni 등은 300↔600 V, 100 kW급 양방향 실리콘 카바이드 STC 시제품에서 약 30 kW 98.7 %, 100 kW 97.4 %의 실측 효율을 보고했고[3], Liu 등은 500 kW급 다상 STC를 설계하고 실험했다[4], [5].</w:t>
+      </w:r>
+    </w:p>
+    <w:p>
+      <w:pPr>
         <w:jc w:val="both"/>
       </w:pPr>
       <w:r>
-        <w:t xml:space="preserve">25 kW 보조버스를 대상으로 8 kW·80 A 유한 링크, ±90 V 직렬 포트와 100 A 경로의 상호 제약을 해석하고 조정단의 설계영역을 정량화한다.</w:t>
-      </w:r>
-    </w:p>
-    <w:p>
-      <w:pPr>
-        <w:pStyle w:val="ListParagraph"/>
-        <w:numPr>
-          <w:ilvl w:val="0"/>
-          <w:numId w:val="2"/>
-        </w:numPr>
-        <w:spacing w:after="60"/>
+        <w:t xml:space="preserve">따라서 2:1 변환, 양방향 운전, 다상화와 100 kW 이상 정격 자체는 새로운 원리가 아니며, Stage A는 이 선행연구를 기술적 근거로 삼는다. 실제 효율은 도통손실, 커패시터 실효전류, 버스바, 냉각과 전자기 간섭 조건에 따라 달라지므로, 프로젝트의 99 %대 효율은 회로 손실 가정에 따른 모델 예측값으로만 사용한다.</w:t>
+      </w:r>
+    </w:p>
+    <w:p>
+      <w:pPr>
+        <w:pStyle w:val="Heading2"/>
+      </w:pPr>
+      <w:r>
+        <w:t xml:space="preserve">2.2 고정비 변환과 부분전력 조정의 결합</w:t>
+      </w:r>
+    </w:p>
+    <w:p>
+      <w:pPr>
         <w:jc w:val="both"/>
       </w:pPr>
       <w:r>
-        <w:t xml:space="preserve">하나의 고정 제어기로 640–920 V 배터리 범위를 담당할 수 있는지 확인하고, 공차·지연·과부하에서 성립하지 않는 경계를 함께 제시한다.</w:t>
-      </w:r>
-    </w:p>
-    <w:p>
-      <w:pPr>
-        <w:pStyle w:val="ListParagraph"/>
-        <w:numPr>
-          <w:ilvl w:val="0"/>
-          <w:numId w:val="2"/>
-        </w:numPr>
-        <w:spacing w:after="60"/>
+        <w:t xml:space="preserve">부분전력처리(Partial Power Processing, PPP)는 전체 부하전력 중 조정에 필요한 일부만 전력전자 변환기가 처리하고, 나머지는 직접 또는 고정비 경로로 전달하는 접근이다. He, Jiang, Nan의 APEC 2018 연구는 STC와 부분전력 조정단을 결합한 전압조정 구조와 48 V에서 12 V로 변환하는 500 W 시제품을 제시했다[6]. Ni 등의 APEC 2019 연구는 전기자동차 응용을 목표로 200–400 V 입력을 1,200 V로 변환하는 4 kW 시제품을 제시했으며, 6배 STC와 질화갈륨 소자 기반 부분전력 강압 조정단을 결합했다[7].</w:t>
+      </w:r>
+    </w:p>
+    <w:p>
+      <w:pPr>
         <w:jc w:val="both"/>
       </w:pPr>
       <w:r>
-        <w:t xml:space="preserve">배터리 전압에 따라 달라지는 조정단의 과도 허용 전력을 부하 등급과 선행 승인 절차에 연결해 전력변환기와 차량 에너지 관리 계층을 공동 검증한다.</w:t>
-      </w:r>
-    </w:p>
-    <w:p>
-      <w:pPr>
-        <w:pStyle w:val="ListParagraph"/>
-        <w:numPr>
-          <w:ilvl w:val="0"/>
-          <w:numId w:val="2"/>
-        </w:numPr>
-        <w:spacing w:after="60"/>
+        <w:t xml:space="preserve">이 연구들로 “고정비 주경로와 작은 조정단의 역할 분담” 원리는 이미 제시되었다. PRISM-Hub는 이 원리를 800 V 차량의 충전, 400 V 보조버스와 48 V·12 V 전원망에 배치하고, 포트 정격과 모드 전환을 하나의 시스템으로 검증하는 데 범위를 둔다.</w:t>
+      </w:r>
+    </w:p>
+    <w:p>
+      <w:pPr>
+        <w:pStyle w:val="Heading2"/>
+      </w:pPr>
+      <w:r>
+        <w:t xml:space="preserve">2.3 직렬 전압보상과 양극성 부분전력 변환</w:t>
+      </w:r>
+    </w:p>
+    <w:p>
+      <w:pPr>
         <w:jc w:val="both"/>
       </w:pPr>
       <w:r>
-        <w:t xml:space="preserve">전전력 승압기, 고정비 변환기와 별도 조정기, 조정 없는 고정비 버스 구조에 대해 손실, 정격, 부품 수와 서비스 품질을 동일 조건에서 비교한다.</w:t>
+        <w:t xml:space="preserve">Wang과 Chen은 직렬 전압보상기를 이용한 차동전력처리 구조의 정격과 추가 전력변환 스트레스를 분석했고[8], Hassanpour 등은 양극성 직렬 포트를 갖는 부분전력 변환기의 0 V 부근 운전, 소자 스트레스, 보호와 소프트스타트를 다루었다[9]. 직렬 전압 가감과 양극성 동작은 알려진 기술이므로, Stage B의 과제는 400 V–100 V 절연 DAB, ±90 V 직렬 포트, 0 V 통과, 프리차지와 보호를 차량 운전모드의 실제 정격 안에서 구현하고 검증하는 것이다.</w:t>
+      </w:r>
+    </w:p>
+    <w:p>
+      <w:pPr>
+        <w:pStyle w:val="Heading2"/>
+      </w:pPr>
+      <w:r>
+        <w:t xml:space="preserve">2.4 공진 제어와 공차 대응</w:t>
       </w:r>
     </w:p>
     <w:p>
@@ -2108,15 +2067,7 @@
         <w:jc w:val="both"/>
       </w:pPr>
       <w:r>
-        <w:t xml:space="preserve">이번 18주 단계의 범위는 MATLAB/Simulink와 Python 교차 구현을 이용한 시뮬레이션 기반 검증이다. 제어기 하드웨어 연동(HIL)과 시제품 실증은 이 단계의 결과로 가설이 유지될 때 후속 단계에서 수행한다.</w:t>
-      </w:r>
-    </w:p>
-    <w:p>
-      <w:pPr>
-        <w:pStyle w:val="Heading1"/>
-      </w:pPr>
-      <w:r>
-        <w:t xml:space="preserve">2. 선행연구 및 유사 기술 분석</w:t>
+        <w:t xml:space="preserve">Li 등의 WiPDA Asia 2018 연구는 공진 탱크의 부품 공차로 고정 타이밍만으로는 소프트 스위칭을 유지하기 어렵다는 문제를 다루고 적응형 온타임 제어를 실험했다[10]. Ni 등[7]도 스위칭주파수를 공진주파수보다 약간 낮추고 데드타임을 조정해 턴오프 ZCS를 얻었다. PRISM-Hub의 고정 타이밍 기준(0.98 f_r)은 이와 같은 방식이며, 부품 공차 표본에서 이 방식이 충분하지 않아 위상별 영교차 추종으로 바꾸었다(4.1절). 공차 대응 타이밍 제어 자체는 선행연구가 있으므로, 기여는 다상 동기, 전류공유, 센서 오차와 방향 전환 조건에서의 구체적인 개선으로 한정한다.</w:t>
       </w:r>
     </w:p>
     <w:p>
@@ -2124,7 +2075,7 @@
         <w:pStyle w:val="Heading2"/>
       </w:pPr>
       <w:r>
-        <w:t xml:space="preserve">2.1 고정비 공진형 스위치드 커패시터 변환</w:t>
+        <w:t xml:space="preserve">2.5 통합 전력전자 제품과 관련 특허</w:t>
       </w:r>
     </w:p>
     <w:p>
@@ -2132,7 +2083,7 @@
         <w:jc w:val="both"/>
       </w:pPr>
       <w:r>
-        <w:t xml:space="preserve">공진형 스위치드 커패시터 또는 스위치드 탱크 변환기(Switched-Tank Converter, STC)는 커패시터 연결 상태와 공진전류를 이용해 정해진 비율로 전압을 변환한다. 공진전류가 0에 가까울 때 스위치를 전환하는 영전류 스위칭(Zero-Current Switching, ZCS)을 적용하면 스위칭 손실을 줄일 수 있다.</w:t>
+        <w:t xml:space="preserve">차량용 복합 직류-직류 변환기와 주행주기 손실 비교는 이미 연구되었다[11]. Vicor NBM9280은 400–920 V와 200–460 V 사이의 비절연 2:1 고정비 모듈로, 모듈 하나로 800 V 배터리에서 37 kW급 400 V 부속부하 레일을 공급하며 최고 효율 99.0 %를 제시한다. 같은 회사는 양방향 모듈로 기존 400 V 부품과 충전 인프라를 800 V 차량에 맞추는 방식도 발표했다[12]. 즉 고정비 모듈을 통한 400 V 충전 호환과 400 V 부하 공급은 산업계에 이미 있으며, 이때 400 V 부하는 배터리 전압에 따라 변하는 비조정 전압을 받는다. Stage A의 모듈당 37.5 kW 목표도 같은 등급이므로, PRISM-Hub의 차별점은 조정된 보조버스를 직렬 조정단 뒤에 분리하는 데 있고 그 가치는 보조버스 조정이 실제로 필요한지(3.2절)에 달려 있다.</w:t>
       </w:r>
     </w:p>
     <w:p>
@@ -2140,7 +2091,15 @@
         <w:jc w:val="both"/>
       </w:pPr>
       <w:r>
-        <w:t xml:space="preserve">Ni 등의 IEEE Transactions on Power Electronics 2020 연구는 300 V와 600 V 사이에서 동작하는 100 kW급 양방향 실리콘 카바이드 STC 시제품을 제시하고, 약 30 kW에서 98.7 %, 100 kW 전부하에서 약 97.4 %의 실측 효율을 보고했다[3]. Liu 등은 500 kW급 다상 STC의 설계와 후속 실험을 다루었다[4], [5]. 이 결과들은 고정비 공진 변환기의 대전력 확장 가능성을 보여 주지만, 2:1 변환, 양방향 운전, 다상화 또는 100 kW 이상 정격 자체가 새로운 원리는 아니라는 점도 보여 준다.</w:t>
+        <w:t xml:space="preserve">Preh Combo Box는 800 V 부스터, 전력분배장치와 3.5 kW 직류-직류 변환기를 하나의 제품으로 통합했다[13]. NIO USA(원출원인)의 US10363828B1·US10632863B2는 800 V 충전 중 공진형 스위치드 커패시터 경로로 400 V 구동계 버스를 공급하는 구성을[14], Karma Automotive의 US11235676B2 등은 800/400 V 양방향 변환과 보조전원모듈의 결합을 공개한다[15]. 전력 방향이나 사용사례가 달라도 기술영역이 겹치므로 장치 통합이나 400/800 V 공존만으로 독창성을 주장할 수 없으며, 청구항과 회로의 항목별 대조가 필요하다. 제조사 수치는 공개자료이며 독립 검증 결과가 아니다.</w:t>
+      </w:r>
+    </w:p>
+    <w:p>
+      <w:pPr>
+        <w:pStyle w:val="Heading2"/>
+      </w:pPr>
+      <w:r>
+        <w:t xml:space="preserve">2.6 차량 부하 관리와 상위 제약 계층</w:t>
       </w:r>
     </w:p>
     <w:p>
@@ -2148,135 +2107,7 @@
         <w:jc w:val="both"/>
       </w:pPr>
       <w:r>
-        <w:t xml:space="preserve">이 선행연구는 Stage A의 기술적 근거를 제공한다. 동시에 실제 효율은 반도체 도통손실, 커패시터 실효전류, 공진 인덕터, 버스바, 게이트 구동, 냉각과 전자기 간섭 조건에 따라 달라진다. 프로젝트의 99 %대 효율값은 회로 손실 가정에 따른 모델 예측값이며 실측 효율과 구분한다.</w:t>
-      </w:r>
-    </w:p>
-    <w:p>
-      <w:pPr>
-        <w:pStyle w:val="Heading2"/>
-      </w:pPr>
-      <w:r>
-        <w:t xml:space="preserve">2.2 고정비 변환과 부분전력 조정의 결합</w:t>
-      </w:r>
-    </w:p>
-    <w:p>
-      <w:pPr>
-        <w:jc w:val="both"/>
-      </w:pPr>
-      <w:r>
-        <w:t xml:space="preserve">부분전력처리(Partial Power Processing, PPP)는 전체 부하전력 중 조정에 필요한 일부만 전력전자 변환기가 처리하고, 나머지는 직접 또는 고정비 경로로 전달하는 접근이다. He, Jiang, Nan의 APEC 2018 연구는 STC와 부분전력 조정단을 결합한 전압조정 구조와 48 V에서 12 V로 변환하는 500 W 시제품을 제시했다[6]. Ni 등의 APEC 2019 연구는 전기자동차 응용을 목표로 200–400 V 입력을 1,200 V로 변환하는 4 kW 시제품을 제시했으며, 6배 STC와 질화갈륨 소자 기반 부분전력 강압 조정단을 결합했다[7].</w:t>
-      </w:r>
-    </w:p>
-    <w:p>
-      <w:pPr>
-        <w:jc w:val="both"/>
-      </w:pPr>
-      <w:r>
-        <w:t xml:space="preserve">이 연구들은 “고정비 경로와 작은 조정단의 역할 분담”이라는 원리가 이미 제시되었음을 보여 준다. PRISM-Hub의 연구 범위는 이 원리를 800 V 차량의 충전, 400 V 보조버스와 48 V·12 V 전원망에 배치하고, 각 포트의 정격과 모드 전환 조건을 하나의 시스템으로 검증하는 데 있다.</w:t>
-      </w:r>
-    </w:p>
-    <w:p>
-      <w:pPr>
-        <w:pStyle w:val="Heading2"/>
-      </w:pPr>
-      <w:r>
-        <w:t xml:space="preserve">2.3 직렬 전압보상과 양극성 부분전력 변환</w:t>
-      </w:r>
-    </w:p>
-    <w:p>
-      <w:pPr>
-        <w:jc w:val="both"/>
-      </w:pPr>
-      <w:r>
-        <w:t xml:space="preserve">Wang과 Chen은 직렬 전압보상기를 이용한 차동전력처리 구조의 정격과 추가 전력변환 스트레스를 분석했다[8]. Hassanpour 등은 양방향 승압·강압 부분전력 변환기의 양극성 직렬 포트, 0 V 부근 운전, 소자 스트레스, 보호와 소프트스타트를 다루었다[9]. 이 연구들은 작은 직렬 전압을 더하거나 빼서 버스전압을 조정하는 원리와 양극성 동작이 이미 알려진 기술영역임을 보여 준다.</w:t>
-      </w:r>
-    </w:p>
-    <w:p>
-      <w:pPr>
-        <w:jc w:val="both"/>
-      </w:pPr>
-      <w:r>
-        <w:t xml:space="preserve">따라서 Stage B의 연구과제는 양극성 보상 자체의 최초성보다, 400 V와 100 V 링크 사이의 절연 DAB, ±90 V 직렬 포트, 0 V 통과, 프리차지, 보호 및 차량 운전모드를 실제 정격 안에서 구현하고 검증하는 데 있다.</w:t>
-      </w:r>
-    </w:p>
-    <w:p>
-      <w:pPr>
-        <w:pStyle w:val="Heading2"/>
-      </w:pPr>
-      <w:r>
-        <w:t xml:space="preserve">2.4 공진 제어와 공차 대응</w:t>
-      </w:r>
-    </w:p>
-    <w:p>
-      <w:pPr>
-        <w:jc w:val="both"/>
-      </w:pPr>
-      <w:r>
-        <w:t xml:space="preserve">Li 등의 WiPDA Asia 2018 연구는 공진 탱크의 부품 공차로 고정 타이밍만으로는 소프트 스위칭을 유지하기 어렵다는 문제를 다루고 적응형 온타임 제어를 실험했다[10]. Ni 등[7]도 스위칭주파수를 공진주파수보다 약간 낮추고 데드타임을 조정해 턴오프 ZCS를 얻었다. PRISM-Hub의 고정 타이밍 기준(0.98 f_r)은 이와 같은 방식이며, 부품 공차 표본에서 이 방식이 충분하지 않아 위상별 영교차 추종으로 바꾸었다(4.2절). 공차에 대응해 스위칭 시점을 조정한다는 목표 자체는 선행연구가 있으므로, 향후에는 다상 동기, 전류공유, 센서 오차와 방향 전환 조건에서 구체적인 개선효과를 제시해야 한다.</w:t>
-      </w:r>
-    </w:p>
-    <w:p>
-      <w:pPr>
-        <w:pStyle w:val="Heading2"/>
-      </w:pPr>
-      <w:r>
-        <w:t xml:space="preserve">2.5 통합 전력전자 제품과 관련 특허</w:t>
-      </w:r>
-    </w:p>
-    <w:p>
-      <w:pPr>
-        <w:jc w:val="both"/>
-      </w:pPr>
-      <w:r>
-        <w:t xml:space="preserve">차량용 복합 직류-직류 변환기와 주행주기 기반 손실 비교도 이미 연구되었다[11]. Vicor의 NBM9280은 400–920 V와 200–460 V 사이에서 동작하는 비절연 2:1 고정비 모듈이며, 공개 자료는 모듈 하나로 800 V 배터리에서 37 kW급 400 V 부속부하 레일을 공급하고 최고 효율 99.0 %를 제시한다[12]. 같은 회사는 양방향 모듈로 기존 400 V 부품과 충전 인프라를 800 V 차량 구조에 맞추는 방식도 발표했다[12]. 즉 고정비 모듈을 통한 400 V 충전 호환과 400 V 부하 공급은 산업계에 이미 제시된 개념이며, 이 방식에서 400 V 부하는 배터리 전압에 따라 변하는 비조정 전압을 받는다.</w:t>
-      </w:r>
-    </w:p>
-    <w:p>
-      <w:pPr>
-        <w:jc w:val="both"/>
-      </w:pPr>
-      <w:r>
-        <w:t xml:space="preserve">PRISM-Hub Stage A의 모듈당 37.5 kW 목표도 같은 등급이다. 따라서 Stage A는 산업적으로 성립 가능한 기술 수준을 설계 전제로 삼고, PRISM-Hub의 차별점은 조정된 보조버스를 직렬 조정단 뒤에 분리하는 데 둔다. 이 차별점의 가치는 보조버스 조정이 실제로 필요한지(3.2절)에 달려 있다. Preh의 Combo Box는 800 V 부스터, 전력분배장치와 3.5 kW 직류-직류 변환기를 하나의 제품에 통합한다[13]. 제조사 수치는 공개자료이므로 독립적인 성능검증 결과와 구분한다.</w:t>
-      </w:r>
-    </w:p>
-    <w:p>
-      <w:pPr>
-        <w:jc w:val="both"/>
-      </w:pPr>
-      <w:r>
-        <w:t xml:space="preserve">NIO USA Inc.(원출원인)의 US10363828B1과 US10632863B2는 800 V 직류 충전으로 직렬 배터리 구성을 충전하면서 공진형 스위치드 커패시터 경로가 400 V 구동계 버스를 공급하고 배터리 모듈 균형을 돕는 구성을 공개한다[14]. 이 특허의 중심 사용사례는 PRISM-Hub의 400 V 충전기에서 800 V 배터리로 향하는 전력흐름과 같지 않다. 그러나 공진형 스위치드 커패시터를 이용한 차량의 400/800 V 공존이라는 기술영역이 겹치므로 전력 방향 차이만으로 독창성이 입증되지는 않는다.</w:t>
-      </w:r>
-    </w:p>
-    <w:p>
-      <w:pPr>
-        <w:jc w:val="both"/>
-      </w:pPr>
-      <w:r>
-        <w:t xml:space="preserve">Karma Automotive의 US11235676B2, WO2020257534A1 및 EP3987646A1/A4는 800/400 V 양방향 변환과 보조전원모듈의 결합을 다룬다[15]. 이 자료는 “800/400 V 변환과 보조전원 기능의 통합” 자체가 새로운 개념이 아님을 보여 주며, 관련 청구항과 회로를 PRISM-Hub의 고정비 RSC, 부유 링크 PPRC 및 직렬 주입 구조와 항목별로 비교할 필요가 있다.</w:t>
-      </w:r>
-    </w:p>
-    <w:p>
-      <w:pPr>
-        <w:pStyle w:val="Heading2"/>
-      </w:pPr>
-      <w:r>
-        <w:t xml:space="preserve">2.6 차량 부하 관리와 상위 제약 계층</w:t>
-      </w:r>
-    </w:p>
-    <w:p>
-      <w:pPr>
-        <w:jc w:val="both"/>
-      </w:pPr>
-      <w:r>
-        <w:t xml:space="preserve">Jaguar Land Rover의 US20190023203A1은 고전압·저전압 전력망, 변환기 포화, 가용전류 및 부하 우선순위에 따른 승인·제한을 설명한다[16]. Robert Bosch GmbH의 EP1053129A1은 차량 부하의 피크 전력요구를 사전에 평가하고, 전력망 상태와 우선순위에 따라 부하 실행을 승인하거나 다음 계산주기로 지연하는 방식을 다룬다[17]. Reference Governor와 Command Governor 연구도 안정화된 내부 제어기 위에 명령 조정 계층을 두어 상태와 입력 제약을 만족시키는 일반적인 방법을 제공한다[18].</w:t>
-      </w:r>
-    </w:p>
-    <w:p>
-      <w:pPr>
-        <w:jc w:val="both"/>
-      </w:pPr>
-      <w:r>
-        <w:t xml:space="preserve">따라서 차량 통신신호, 가용전류와 우선순위를 이용해 부하를 제한하는 SALS의 넓은 원리는 고유하지 않다. PRISM-Hub가 목표로 하는 구체적인 기여 후보는 조정단의 배터리 전압 의존 과도 허용 전력, 가정한 통신 지연 범위와 부하 기동의 인과성 및 서비스 손실을 함께 고려한 승인 조건을 정량화하는 데 있다.</w:t>
+        <w:t xml:space="preserve">Jaguar Land Rover의 US20190023203A1은 변환기 포화, 가용전류와 우선순위에 따른 부하 승인·제한을[16], Robert Bosch GmbH의 EP1053129A1은 피크 전력요구의 사전 평가와 부하 실행 지연을[17] 다룬다. Reference Governor와 Command Governor는 안정화된 내부 제어기 위에서 상태·입력 제약을 만족시키는 일반적인 명령 조정 방법이다[18]. 따라서 SALS의 넓은 원리는 고유하지 않으며, 기여 후보는 조정단의 배터리 전압 의존 과도 허용 전력, 통신 지연과 부하 기동의 인과성, 서비스 손실을 함께 고려한 승인 조건의 정량화로 한정한다.</w:t>
       </w:r>
     </w:p>
     <w:p>
@@ -3219,7 +3050,7 @@
         <w:jc w:val="both"/>
       </w:pPr>
       <w:r>
-        <w:t xml:space="preserve">N2. 유한 100 V 링크를 포함한 조정단에서 부하전류, 경로전류, 링크전류, 링크전력, 변조율과 직렬전압 한계를 공동 설계하고, 정적·과도 운전 가능영역을 배터리 전압별로 수치화하는 정격 설계 방법. 평균모델 수준에서 부분적으로 확인했다(6.4–6.8절).</w:t>
+        <w:t xml:space="preserve">N2. 유한 100 V 링크를 포함한 조정단에서 부하전류, 경로전류, 링크전류, 링크전력, 변조율과 직렬전압 한계를 공동 설계하고, 정적·과도 운전 가능영역을 배터리 전압별로 수치화하는 정격 설계 방법. 평균모델 수준에서 부분적으로 확인했다(3.4절, 6.4–6.6절).</w:t>
       </w:r>
     </w:p>
     <w:p>
@@ -4040,7 +3871,7 @@
                 <w:sz w:val="17"/>
                 <w:szCs w:val="17"/>
               </w:rPr>
-              <w:t xml:space="preserve">4.3절</w:t>
+              <w:t xml:space="preserve">4.2절</w:t>
             </w:r>
           </w:p>
         </w:tc>
@@ -5591,7 +5422,7 @@
         <w:jc w:val="both"/>
       </w:pPr>
       <w:r>
-        <w:t xml:space="preserve">이 결과는 다음 네 전류를 구분해야 함을 보여 준다(표 4).</w:t>
+        <w:t xml:space="preserve">처리전력은 800 V 부근에서 거의 0이고 640 V 쪽에서 가장 크다(그림 2(b)). 설치 링크 정격 8 kW는 25 kW 보조버스의 32 %, 150 kW 충전전력의 5.3 %이며 충전전류는 구조상 Stage B를 지나지 않는다. 이 결과는 가설 H1(정격 분리)을 평균모델 수준에서 지지하지만, 부분전력 경로의 이점은 배터리 전압이 낮을수록 작아진다. 또한 이 결과는 다음 네 전류를 구분해야 함을 보여 준다(표 4).</w:t>
       </w:r>
     </w:p>
     <w:p>
@@ -6969,7 +6800,7 @@
         <w:jc w:val="both"/>
       </w:pPr>
       <w:r>
-        <w:t xml:space="preserve">스트레스 시험의 필수부하 최악 상한은 14.9 A + 2.4×24.9 A + 9 A + 7.5 A = 91.16 A(400 V 기준 36.5 kW)로 25 kW 연속정격을 넘는다. 컴프레서 서지 하나(59.8 A)가 SALS 정적 예산 59.375 A와 같은 크기다. 이 조건은 부하 승인으로 해결할 수 없으므로 요구사항 단계에서 다음 중 하나로 정해야 한다. (a) 20 ms급 단시간 과부하 정격을 정의하고 제어기와 포트가 이를 견디게 한다. (b) 컴프레서 소프트스타트 등으로 비지연 부하의 서지를 제한한다. (c) 해당 조건을 운전범위 밖으로 정의한다. 6.6절의 과도 허용 전력 분석은 (a)를 판단하는 근거가 된다.</w:t>
+        <w:t xml:space="preserve">스트레스 시험의 필수부하 최악 상한은 14.9 A + 2.4×24.9 A + 9 A + 7.5 A = 91.16 A(400 V 기준 36.5 kW)로 25 kW 연속정격을 넘고, SALS 정적 예산보다 31.8 A 크다. 컴프레서 서지 하나(59.8 A)가 SALS 정적 예산 59.375 A와 같은 크기다. 이 조건은 부하 승인으로 해결할 수 없으므로 요구사항 단계에서 다음 중 하나로 정해야 한다. (a) 20 ms급 단시간 과부하 정격을 정의하고 제어기와 포트가 이를 견디게 한다. (b) 컴프레서 소프트스타트 등으로 비지연 부하의 서지를 제한한다. (c) 해당 조건을 운전범위 밖으로 정의한다. 6.6절의 과도 허용 전력 분석은 (a)를 판단하는 근거가 된다.</w:t>
       </w:r>
     </w:p>
     <w:p>
@@ -6985,7 +6816,7 @@
         <w:jc w:val="both"/>
       </w:pPr>
       <w:r>
-        <w:t xml:space="preserve">충전전류가 Stage B를 통과하면 8 kW 부분전력 조정단이 대전력 충전경로의 병목이 된다. 현재 후보 구조는 충전기를 Stage A 출력 노드 V_A에 연결하고 400 V 보조버스를 직렬 조정단 뒤에 둔다. 충전 대전류는 Stage A를 통해 배터리로 전달되며, Stage B는 충전 중에도 보조버스를 조정하도록 설계한다. 이 구조는 이전의 충전 바이패스 후보보다 경로 구성이 단순하지만, 충전기 접속·해제, 충전 중 400 V 부하, Stage C 동시 운전과 고장 전파를 포함한 통합 모델로는 아직 검증되지 않았다.</w:t>
+        <w:t xml:space="preserve">현재 후보 구조에서 충전 대전류는 V_A에서 Stage A를 거쳐 배터리로 가고, Stage B는 충전 중에도 보조버스를 조정한다. 이 구조는 이전의 충전 바이패스 후보보다 경로가 단순하지만, 충전기 접속·해제, 충전 중 400 V 부하와 Stage C 동시 운전, 고장 전파를 포함한 통합 모델로는 아직 검증하지 않았다.</w:t>
       </w:r>
     </w:p>
     <w:p>
@@ -6993,7 +6824,15 @@
         <w:jc w:val="both"/>
       </w:pPr>
       <w:r>
-        <w:t xml:space="preserve">이 배치에는 두 가지 전제가 있다. 첫째, 충전기 출력범위가 차량 입구 기준 V_A의 변동범위(약 320–460 V와 경로 강하)를 포함해야 한다. 둘째, 충전 통신에서 차량은 팩이 아니라 V_A 기준의 전압·전류 한계(팩 전압의 1/2, 팩 전류의 2배)를 충전기에 제시해야 한다. 또한 375 A 전류 제한에서 V_A가 324 V이면 전달 전력은 약 121 kW로 150 kW보다 낮다.</w:t>
+        <w:t xml:space="preserve">이 배치에는 두 가지 전제가 있다. 첫째, 충전기 출력범위가 차량 입구 기준 V_A의 변동범위(약 320–460 V와 경로 강하)를 포함해야 한다. 둘째, 충전 통신에서 차량은 팩이 아니라 V_A 기준의 전압·전류 한계(팩 전압의 1/2, 팩 전류의 2배)를 충전기에 제시해야 한다. 375 A 전류 제한에서 V_A가 324 V이면 전달 전력은 약 121 kW로 150 kW보다 낮다.</w:t>
+      </w:r>
+    </w:p>
+    <w:p>
+      <w:pPr>
+        <w:jc w:val="both"/>
+      </w:pPr>
+      <w:r>
+        <w:t xml:space="preserve">Stage B가 충전전류를 나르지 않더라도 충전 중 배터리와 무관하지는 않다. 보조부하 전력은 V_A에서 빠져나가므로 배터리에 들어가는 전력은 그만큼 줄고(충전 150 kW, 보조부하 25 kW이면 손실 제외 약 125 kW), 충전기 전류 제어보다 빠른 보조부하 변화는 그 순간 Stage A를 통해 배터리가 공급한다. 따라서 차량은 보조부하 몫을 더한 전류를 충전기에 요청해야 하며, 이 상호작용은 8.4절의 통합 시험에서 확인한다.</w:t>
       </w:r>
     </w:p>
     <w:p>
@@ -7014,14 +6853,6 @@
     </w:p>
     <w:p>
       <w:pPr>
-        <w:jc w:val="both"/>
-      </w:pPr>
-      <w:r>
-        <w:t xml:space="preserve">지연 가능한 히터와 저우선 부하는 조정단의 여유에 맞춰 실행시점을 조정할 수 있다. 그러나 부하 관리는 물리적인 전력 부족을 없애지 못한다. 비지연 부하만으로 변환기 용량을 넘는 경우에는 부하 자체의 기동 제한, 상시 예비용량 또는 하드웨어 정격 증대가 필요하다(3.5절).</w:t>
-      </w:r>
-    </w:p>
-    <w:p>
-      <w:pPr>
         <w:pStyle w:val="Heading1"/>
       </w:pPr>
       <w:r>
@@ -7033,23 +6864,7 @@
         <w:pStyle w:val="Heading2"/>
       </w:pPr>
       <w:r>
-        <w:t xml:space="preserve">4.1 전체 구성</w:t>
-      </w:r>
-    </w:p>
-    <w:p>
-      <w:pPr>
-        <w:jc w:val="both"/>
-      </w:pPr>
-      <w:r>
-        <w:t xml:space="preserve">그림 1의 후보 구조에서 800 V 배터리는 Stage A를 거쳐 V_A 노드에 연결되고, V_A와 400 V 보조버스 사이에 Stage B의 직렬 포트가 들어간다. 400 V급 충전기는 V_A 노드에 접속하며, 400 V 보조부하와 Stage C는 보조버스에서 전력을 받는다. Stage B의 DAB는 보조버스에서 전력을 받아 부유 100 V 링크를 거쳐 직렬 포트로 보상전압을 만든다. SALS는 이 구조의 정격을 기준으로 지연 가능한 부하의 실행을 승인한다.</w:t>
-      </w:r>
-    </w:p>
-    <w:p>
-      <w:pPr>
-        <w:pStyle w:val="Heading2"/>
-      </w:pPr>
-      <w:r>
-        <w:t xml:space="preserve">4.2 Stage A: 2:1 고정비 대전력 경로</w:t>
+        <w:t xml:space="preserve">4.1 Stage A: 2:1 고정비 대전력 경로</w:t>
       </w:r>
     </w:p>
     <w:p>
@@ -7419,7 +7234,7 @@
                 <w:sz w:val="17"/>
                 <w:szCs w:val="17"/>
               </w:rPr>
-              <w:t xml:space="preserve">정·역방향 각 20건 중 0건 실패, 최대 약 1.1 %(공차 포함 MATLAB 1.131 %, Python 1.146 %)</w:t>
+              <w:t xml:space="preserve">정·역방향 각 20건 중 0건 실패(기준: 턴오프 잔류전류 5 % 이하), 최대 약 1.1 %(MATLAB 1.131 %, Python 1.146 %)</w:t>
             </w:r>
           </w:p>
         </w:tc>
@@ -7713,7 +7528,7 @@
         <w:jc w:val="both"/>
       </w:pPr>
       <w:r>
-        <w:t xml:space="preserve">스위칭 동작을 포함한 상미분방정식(Ordinary Differential Equation, ODE) 모델에서 고정 타이밍은 부품 공차 표본 20건 중 16건이 ZCS 기준(턴오프 잔류전류 5 % 이하)을 벗어났으나, 자기발진 방식은 정·역방향 표본에서 모두 통과했다. 역방향 검출의 극성 오류는 수정했다. 8위상 손실과 모듈 셰딩 값은 모델 예측이며, 센서 지연, 오프셋, 방향 전환, 다상 동기, 전류공유와 하드웨어 파형은 추가 검증이 필요하다.</w:t>
+        <w:t xml:space="preserve">결과는 스위칭 동작을 포함한 상미분방정식(Ordinary Differential Equation, ODE) 모델에서 얻었고, 역방향 검출의 극성 오류를 수정한 뒤의 값이다. 손실과 모듈 셰딩 값은 모델 예측이며, 센서 지연·오프셋, 방향 전환, 다상 동기와 전류공유는 스위칭 모델과 하드웨어에서 확인해야 한다.</w:t>
       </w:r>
     </w:p>
     <w:p>
@@ -7721,7 +7536,7 @@
         <w:pStyle w:val="Heading2"/>
       </w:pPr>
       <w:r>
-        <w:t xml:space="preserve">4.3 Stage B: 유한 링크 2단 부분전력 조정기</w:t>
+        <w:t xml:space="preserve">4.2 Stage B: 유한 링크 2단 부분전력 조정기</w:t>
       </w:r>
     </w:p>
     <w:p>
@@ -7799,10 +7614,18 @@
     </w:p>
     <w:p>
       <w:pPr>
+        <w:pStyle w:val="Heading2"/>
+      </w:pPr>
+      <w:r>
+        <w:t xml:space="preserve">4.3 Stage C: 48 V 및 12 V 절연 전원</w:t>
+      </w:r>
+    </w:p>
+    <w:p>
+      <w:pPr>
         <w:jc w:val="both"/>
       </w:pPr>
       <w:r>
-        <w:t xml:space="preserve">평균모델의 상태변수는 Stage A 경로전류, 직렬전압, 400 V 버스전압, H-브리지 필터전류, 링크전압 및 DAB 링크전류다. 이 구성은 초기 이상 전류원 모델에서 빠졌던 링크 저장에너지, 변조율, 링크전류, 방향별 효율과 포트별 정격을 명시적으로 다룬다.</w:t>
+        <w:t xml:space="preserve">Stage C는 400 V 보조버스에서 48 V 전원망을 공급하는 CLLC 공진 변환기다. CLLC는 변압기 양쪽의 인덕터와 커패시터로 구성된 공진형 절연 변환기이며 양방향 전력전달에 적합한 후보 중 하나다. 12 V 출력은 48 V 뒤의 강압 변환기가 담당한다. 초기 3 kW 스위칭 수준 ODE 모델에서 공진점 이득과 양방향 전력흐름을 검토했으나, 48 V와 12 V의 동시 최대부하를 만족하려면 약 5 kW급 재설계가 필요하다. 공진탱크, 변압기, 정류 손실, 열설계와 회생 전류 폐루프는 아직 완료되지 않았다.</w:t>
       </w:r>
     </w:p>
     <w:p>
@@ -7810,7 +7633,7 @@
         <w:pStyle w:val="Heading2"/>
       </w:pPr>
       <w:r>
-        <w:t xml:space="preserve">4.4 Stage C: 48 V 및 12 V 절연 전원</w:t>
+        <w:t xml:space="preserve">4.4 SALS: 포화 인지형 부하 승인 계층</w:t>
       </w:r>
     </w:p>
     <w:p>
@@ -7818,7 +7641,23 @@
         <w:jc w:val="both"/>
       </w:pPr>
       <w:r>
-        <w:t xml:space="preserve">Stage C는 400 V 보조버스에서 48 V 전원망을 공급하는 CLLC 공진 변환기다. CLLC는 변압기 양쪽의 인덕터와 커패시터로 구성된 공진형 절연 변환기이며 양방향 전력전달에 적합한 후보 중 하나다. 12 V 출력은 48 V 뒤의 강압 변환기가 담당한다. 초기 3 kW 스위칭 수준 ODE 모델에서 공진점 이득과 양방향 전력흐름을 검토했으나, 48 V와 12 V의 동시 최대부하를 만족하려면 약 5 kW급 재설계가 필요하다. 공진탱크, 변압기, 정류 손실, 열설계와 회생 전류 폐루프는 아직 완료되지 않았다.</w:t>
+        <w:t xml:space="preserve">SALS는 빠른 전압제어기가 아니라 상위 부하 승인 계층이다. 현재 구현은 보조버스 연속정격 25 kW에 95 % 여유를 둔 정적 예산(400 V 기준 59.375 A)에서 비지연 부하를 뺀 나머지를 정온도계수(Positive Temperature Coefficient, PTC) 히터, 배터리 히터, 48 V 저우선 부하의 요청에 우선순위대로 배분한다. 사건 범위를 확인할 수 없으면 조정부하 승인을 0으로 두는 fail-closed 동작을 쓴다.</w:t>
+      </w:r>
+    </w:p>
+    <w:p>
+      <w:pPr>
+        <w:jc w:val="both"/>
+      </w:pPr>
+      <w:r>
+        <w:t xml:space="preserve">정적 연속 한계가 625 V 이상에서 25 kW로 일정하므로 이 예산은 배터리 전압과 무관하다. 과도 허용 전력의 전압 의존성(6.6절)과 에너지 요구·최소 동작시간·재기동 같은 시간 결합은 아직 반영하지 않았으므로, 현재 구현은 단일 시점 우선순위 승인이다.</w:t>
+      </w:r>
+    </w:p>
+    <w:p>
+      <w:pPr>
+        <w:jc w:val="both"/>
+      </w:pPr>
+      <w:r>
+        <w:t xml:space="preserve">관측하지 못한 사건에 대비하려면 부하 측 전자제어기(Electronic Control Unit, ECU)가 부하를 켜기 전에 승인을 받는 절차가 필요하다. 이 절차가 성립하려면 부하 등급을 먼저 정해야 한다. 비지연 부하는 승인을 거부할 수 없으므로, 사전 승인은 기동 시점을 정해진 상한 안에서 늦추는 것으로 정의하고 등급별 최대 지연을 요구사항으로 둔다(표 5).</w:t>
       </w:r>
     </w:p>
     <w:p>
@@ -7826,39 +7665,7 @@
         <w:pStyle w:val="Heading2"/>
       </w:pPr>
       <w:r>
-        <w:t xml:space="preserve">4.5 SALS: 포화 인지형 부하 승인 계층</w:t>
-      </w:r>
-    </w:p>
-    <w:p>
-      <w:pPr>
-        <w:jc w:val="both"/>
-      </w:pPr>
-      <w:r>
-        <w:t xml:space="preserve">SALS는 빠른 전압제어기가 아니라 상위 부하 승인 계층이다. 현재 구현은 보조버스 연속정격 25 kW에 95 % 여유를 둔 정적 예산(400 V 기준 59.375 A)에서 비지연 부하를 뺀 나머지를 정온도계수(Positive Temperature Coefficient, PTC) 히터, 배터리 히터, 48 V 저우선 부하의 요청에 우선순위대로 배분한다. 사건 범위를 확인할 수 없으면 조정부하 승인을 0으로 두는 fail-closed 동작을 쓴다.</w:t>
-      </w:r>
-    </w:p>
-    <w:p>
-      <w:pPr>
-        <w:jc w:val="both"/>
-      </w:pPr>
-      <w:r>
-        <w:t xml:space="preserve">이 정적 예산은 640–920 V에서 배터리 전압과 무관하다. 조정단의 정적 연속 한계가 625 V 이상에서 정격 25 kW로 일정하기 때문이다. 반면 과도 허용 전력은 배터리 전압에 따라 크게 달라지므로(6.6절), 전압 의존 여유를 승인에 반영하는 기능은 아직 구현되지 않았다. 또한 현재 로직에는 에너지 요구, 최소 동작시간, 램프, 재기동 비용 같은 시간 결합이 없으므로 단일 시점 우선순위 승인으로 정의한다.</w:t>
-      </w:r>
-    </w:p>
-    <w:p>
-      <w:pPr>
-        <w:jc w:val="both"/>
-      </w:pPr>
-      <w:r>
-        <w:t xml:space="preserve">관측하지 못한 사건에 대비하려면 부하 측 전자제어기(Electronic Control Unit, ECU)가 부하를 켜기 전에 승인을 받는 절차가 필요하다. 이 절차가 성립하려면 부하 등급을 먼저 정해야 한다. 비지연 부하는 승인을 거부할 수 없으므로, 사전 승인은 기동 시점을 정해진 상한 안에서 늦추는 것으로 정의하고 등급별 최대 지연을 요구사항으로 둔다(표 5).</w:t>
-      </w:r>
-    </w:p>
-    <w:p>
-      <w:pPr>
-        <w:pStyle w:val="Heading2"/>
-      </w:pPr>
-      <w:r>
-        <w:t xml:space="preserve">4.6 주요 운전 모드</w:t>
+        <w:t xml:space="preserve">4.5 주요 운전 모드</w:t>
       </w:r>
     </w:p>
     <w:p>
@@ -8705,14 +8512,6 @@
     </w:p>
     <w:p>
       <w:pPr>
-        <w:jc w:val="both"/>
-      </w:pPr>
-      <w:r>
-        <w:t xml:space="preserve">모든 모드를 하나의 연결된 모델에서 전환하고 보호까지 검증하는 작업은 남아 있다. 400 V급 충전 모드에서는 충전기 전압, 전류와 전력 한계를 각각 적용해야 하며, 375 A 전류 제한 때문에 저전압 구간의 전달 전력은 150 kW보다 낮다.</w:t>
-      </w:r>
-    </w:p>
-    <w:p>
-      <w:pPr>
         <w:pStyle w:val="Heading1"/>
       </w:pPr>
       <w:r>
@@ -9575,7 +9374,15 @@
         <w:jc w:val="both"/>
       </w:pPr>
       <w:r>
-        <w:t xml:space="preserve">주요 검증 절차는 정상상태 전력수지와 평형점 계산, 6상태 평균모델의 에너지 보존 검산, 부하 증가·제거·회생·0 V 통과·과부하 시험, 실제 상태를 강제로 제한하지 않는 포트 정격 위반 판정, Python과 MATLAB의 별도 구현 비교, 운전점별 재설계가 없는 공통 고정이득 제어기 시험, 회로 파라미터 단일 변수 ±10 % 공차시험, 전달지연·효율·DAB 응답 시정수 민감도 시험, SALS의 관측 전 사건 반례와 정적 승인 가능조건 시험이다.</w:t>
+        <w:t xml:space="preserve">Simulink 4상태 평균모델(prism_pprc_average_tb.slx)과 Python 오일러 구현의 버스전압 최대차이 0.40 V는 전압강하(약 4.7 V)의 8 % 수준으로 작지 않으며 원인을 아직 규명하지 않았으므로, 이 모델은 최신 결과의 근거로 쓰지 않는다. Stage A·B·C의 Simscape 스위칭 모델은 아직 구축하지 않았다.</w:t>
+      </w:r>
+    </w:p>
+    <w:p>
+      <w:pPr>
+        <w:pStyle w:val="Heading2"/>
+      </w:pPr>
+      <w:r>
+        <w:t xml:space="preserve">5.2 초기 모델의 문제와 보완</w:t>
       </w:r>
     </w:p>
     <w:p>
@@ -9583,7 +9390,23 @@
         <w:jc w:val="both"/>
       </w:pPr>
       <w:r>
-        <w:t xml:space="preserve">Simulink 4상태 평균모델(prism_pprc_average_tb.slx)은 Simulink 실행 경로를 확인하기 위한 것이다. Python 오일러 구현과의 버스전압 최대차이 0.40 V는 같은 이상 모델에서 전압강하(약 4.7 V)의 8 % 수준으로 작지 않으며 원인은 아직 규명하지 않았다. 이 모델은 최신 결과의 근거로 사용하지 않는다. Stage A·B·C의 Simscape 스위칭 모델은 아직 구축하지 않았다.</w:t>
+        <w:t xml:space="preserve">초기 PPRC 평균모델은 DAB가 400 V 버스에서 소비하는 입력전력을 전력수지에 충분히 반영하지 않아 경로전류와 처리전력을 낮게 계산했다. 이를 보완한 뒤 648 V·25 kW의 처리전력은 약 4.8 kW에서 약 6.0 kW로 증가했고 정격 여유도 작아졌다. 이후 Stage B를 이상 직렬 전류원이 아니라 100 V 링크와 H-브리지 필터를 상태로 포함한 모델로 바꾸고, 링크전류 80 A, 경로전류 100 A, 변조율, 링크전압과 8 kW 전력한계를 분리해 판정했다. 또한 명령값만 제한하고 실제 상태는 강제로 잘라내지 않아 과부하와 지연으로 발생하는 정격 위반을 그대로 검출하도록 했다.</w:t>
+      </w:r>
+    </w:p>
+    <w:p>
+      <w:pPr>
+        <w:jc w:val="both"/>
+      </w:pPr>
+      <w:r>
+        <w:t xml:space="preserve">Stage A에서는 역방향 ZCS 검출의 극성 오류를 수정했고, 충전 평균모델에는 150 kW 전력상한과 375 A 전류상한을 함께 적용했다. 고전압 입력 커패시터의 500 V 정격 오류는 1,200 V급 잠정 사양으로 정정했다(부품 선정은 남음). SALS는 통신·부하 지연 범위를 반영하도록 최악값 창을 수정했으나 부하가 관측보다 먼저 시작할 수 있는 인과성 문제가 남아, 이를 고정 반례로 시험에 포함했다. 기존의 “300회 실패 없음”은 전압 안정성 보장이 아니라 축약 부하 스케줄에서 전류정격 초과가 관측되지 않았다는 통계로 범위를 좁혔다.</w:t>
+      </w:r>
+    </w:p>
+    <w:p>
+      <w:pPr>
+        <w:jc w:val="both"/>
+      </w:pPr>
+      <w:r>
+        <w:t xml:space="preserve">초기 계획의 WP4.5는 학습 기반 선행 조정 계층(Anticipatory Regulation Layer, ARL)이었다. ARL은 GRU·TCN 분위수 예측기로 부하 변동을 예측해 조정단에 피드포워드와 사전 승압을 주고, 2단계로 모델예측제어를 붙이는 구상이었다. 검증 결과 상태궤환 제어만으로 60 A급 스텝의 전압강하 기준을 만족했고, 커패시터 축소는 DAB 지연 때문에 불가능했으며, 학습 예측기의 정확도는 단순 지속 예측과 같았고, 점추정·분위수 예측은 서지를 놓쳐 버스 붕괴를 막지 못했다. 이에 따라 예측 피드포워드를 폐기하고, 정격과 관측 인과성을 먼저 다루는 부하 승인 계층 SALS로 범위를 바꾸었다. 같은 검토 과정에서 충전 바이패스를 폐지하고 충전기 접속점을 V_A로 옮겼으며, Stage B를 DAB–100 V 링크–H-브리지의 2단 구조로 바꾸었다.</w:t>
       </w:r>
     </w:p>
     <w:p>
@@ -9591,7 +9414,7 @@
         <w:pStyle w:val="Heading2"/>
       </w:pPr>
       <w:r>
-        <w:t xml:space="preserve">5.2 초기 모델의 문제와 보완</w:t>
+        <w:t xml:space="preserve">5.3 판정 기준과 지연 모델</w:t>
       </w:r>
     </w:p>
     <w:p>
@@ -9599,47 +9422,7 @@
         <w:jc w:val="both"/>
       </w:pPr>
       <w:r>
-        <w:t xml:space="preserve">초기 PPRC 평균모델은 DAB가 400 V 버스에서 소비하는 입력전력을 전력수지에 충분히 반영하지 않아 경로전류와 처리전력을 낮게 계산했다. 이를 보완한 뒤 648 V·25 kW의 처리전력은 약 4.8 kW에서 약 6.0 kW로 증가했고 정격 여유도 작아졌다. 이후 Stage B를 이상 직렬 전류원이 아니라 100 V 링크와 H-브리지 필터를 상태로 포함한 모델로 바꾸고, 링크전류 80 A, 경로전류 100 A, 변조율, 링크전압과 8 kW 전력한계를 분리해 판정했다. 또한 명령값만 제한하고 실제 상태는 강제로 잘라내지 않아 과부하와 지연으로 발생하는 정격 위반을 그대로 검출하도록 했다.</w:t>
-      </w:r>
-    </w:p>
-    <w:p>
-      <w:pPr>
-        <w:jc w:val="both"/>
-      </w:pPr>
-      <w:r>
-        <w:t xml:space="preserve">Stage A에서는 역방향 ZCS 검출의 극성 오류를 수정했다. 충전 평균모델에는 150 kW 전력상한과 375 A 전류상한을 함께 적용하는 기능을 추가했다. 고전압 입력 커패시터의 500 V 정격 오류는 파라미터 수준에서 1,200 V급 잠정 사양으로 정정했으나 실제 부품 선정은 남아 있다. SALS는 선언된 통신·부하 지연 범위를 반영하도록 최악값 창을 수정했지만, 부하가 관측보다 먼저 시작할 수 있는 인과성 문제가 남아 고정 반례와 fail-closed 승인 조건으로 시험에 포함했다. 기존의 “300회 실패 없음”은 전압 안정성 보장이 아니라, 축약 부하 스케줄에서 전류정격 초과가 관측되지 않았다는 통계로 범위를 제한했다.</w:t>
-      </w:r>
-    </w:p>
-    <w:p>
-      <w:pPr>
-        <w:jc w:val="both"/>
-      </w:pPr>
-      <w:r>
-        <w:t xml:space="preserve">초기 18주 계획은 WP1 요구사항, WP2 평균모델과 상태기계, WP3 Simscape 스위칭 모델, WP4 운전 시나리오와 기준 구조, WP4.5 학습 기반 선행 조정 계층(Anticipatory Regulation Layer, ARL), WP5 손실·열·전력밀도, WP6 문서화 순서였다. ARL은 GRU·TCN 분위수 예측기로 부하 변동을 예측해 조정단에 피드포워드와 사전 승압을 주고, 2단계로 모델예측제어를 붙이는 구상이었다. 검증 결과 상태궤환 제어만으로 60 A급 스텝의 전압강하 기준을 만족했고, 커패시터 축소는 DAB 지연 때문에 불가능했으며, 학습 예측기의 정확도는 단순 지속 예측과 같았고, 점추정·분위수 예측은 서지를 놓쳐 버스 붕괴를 막지 못했다. 이에 따라 예측 피드포워드를 폐기하고, 정격과 관측 인과성을 먼저 다루는 부하 승인 계층 SALS로 범위를 바꾸었다. 같은 검토 과정에서 충전 바이패스를 폐지하고 충전기 접속점을 V_A로 옮겼으며, Stage B를 DAB–100 V 링크–H-브리지의 2단 구조로 바꾸었다.</w:t>
-      </w:r>
-    </w:p>
-    <w:p>
-      <w:pPr>
-        <w:pStyle w:val="Heading2"/>
-      </w:pPr>
-      <w:r>
-        <w:t xml:space="preserve">5.3 판정 기준과 지연 모델</w:t>
-      </w:r>
-    </w:p>
-    <w:p>
-      <w:pPr>
-        <w:jc w:val="both"/>
-      </w:pPr>
-      <w:r>
-        <w:t xml:space="preserve">공통 제어기 시험은 미리 충전된 평형점에서 시작해 1 ms에 정전력 부하를 변경하고 20 ms까지 계산한다. “60 A 시험”은 400 V 기준 1 kW에서 25 kW로 증가하는 24 kW 부하변화, 즉 60 A 상당의 정전력 스텝을 뜻한다. 모든 순간에 부하전류가 정확히 60 A만큼 변하는 시험은 아니다.</w:t>
-      </w:r>
-    </w:p>
-    <w:p>
-      <w:pPr>
-        <w:jc w:val="both"/>
-      </w:pPr>
-      <w:r>
-        <w:t xml:space="preserve">전압 판정은 스텝 후 400±8 V, 최종 400±4 V, ±4 V 범위 재진입 1 ms 이내, 마지막 1 ms 버스전압 최대·최소 차이 0.1 V 이하다. 포트 판정은 경로·필터 100 A, 링크 80 A·8 kW, 직렬전압 ±90 V, 링크전압 90–110 V, 변조율 ±0.95를 적용한다. 적분간격은 0.2 µs이며, 전달지연 스윕만 0.1 µs로 계산했다.</w:t>
+        <w:t xml:space="preserve">공통 제어기 시험은 미리 충전된 평형점에서 시작해 1 ms에 정전력 부하를 변경하고 20 ms까지 계산한다. “60 A 시험”은 400 V 기준 1 kW에서 25 kW로 증가하는 24 kW 부하변화, 즉 60 A 상당의 정전력 스텝을 뜻한다. 모든 순간에 부하전류가 정확히 60 A만큼 변하는 시험은 아니다. 전압과 포트 판정 기준은 표 2와 같고, 적분간격은 0.2 µs(전달지연 스윕만 0.1 µs)다.</w:t>
       </w:r>
     </w:p>
     <w:p>
@@ -13694,23 +13477,7 @@
         <w:pStyle w:val="Heading2"/>
       </w:pPr>
       <w:r>
-        <w:t xml:space="preserve">6.8 Stage B의 처리전력</w:t>
-      </w:r>
-    </w:p>
-    <w:p>
-      <w:pPr>
-        <w:jc w:val="both"/>
-      </w:pPr>
-      <w:r>
-        <w:t xml:space="preserve">25 kW 정상상태에서 Stage B 링크전력은 640 V 6.44 kW(25.7 %)에서 800 V 0.06 kW(0.2 %)로 줄었다가 920 V −3.24 kW(13.0 %)로 다시 커진다(그림 2(b), 표 3). 설치 링크 정격 8 kW는 25 kW 보조버스의 32 %, 150 kW 충전전력의 5.3 %이며, 충전전류는 구조상 Stage B를 지나지 않는다. 이 결과는 가설 H1(정격 분리)을 평균모델 수준에서 지지하지만, 충전 중 동시 운전과 기준 구조 대비 손실 이점은 아직 판정하지 않았다. 또한 처리전력이 가장 큰 640 V 부근에서는 부분전력 경로의 이점이 가장 작다.</w:t>
-      </w:r>
-    </w:p>
-    <w:p>
-      <w:pPr>
-        <w:pStyle w:val="Heading2"/>
-      </w:pPr>
-      <w:r>
-        <w:t xml:space="preserve">6.9 SALS 인과성과 승인 가능조건</w:t>
+        <w:t xml:space="preserve">6.8 SALS 인과성과 승인 가능조건</w:t>
       </w:r>
     </w:p>
     <w:p>
@@ -14593,23 +14360,7 @@
         <w:jc w:val="both"/>
       </w:pPr>
       <w:r>
-        <w:t xml:space="preserve">648 V 정상 예제(비지연 25 A)에서는 PTC 히터 17.5 A와 배터리 히터 16.875 A를 승인하고 48 V 저우선 부하는 승인하지 않는다. 필수부하 최악 상한 91.16 A는 예산보다 31.785 A 커서 조정부하를 모두 꺼도 해결되지 않는다. 사건 범위를 확인할 수 없으면 조정부하 승인을 0으로 두는 fail-closed 동작을 쓰며, 이 결과를 전압 안전성이 검증된 상태로 판정하지 않는다.</w:t>
-      </w:r>
-    </w:p>
-    <w:p>
-      <w:pPr>
-        <w:pStyle w:val="Heading2"/>
-      </w:pPr>
-      <w:r>
-        <w:t xml:space="preserve">6.10 충전과 Stage C의 검증 상태</w:t>
-      </w:r>
-    </w:p>
-    <w:p>
-      <w:pPr>
-        <w:jc w:val="both"/>
-      </w:pPr>
-      <w:r>
-        <w:t xml:space="preserve">충전 평균모델에는 375 A 전류한계와 150 kW 전력상한을 적용하는 기능이 추가되어, 저전압에서 두 한계가 동시에 성립하지 않는 문제를 모델 수준에서 구분할 수 있다. 그러나 실제 충전기 통신, 접속·해제, Stage A 모듈 전환, 보조버스 동시 조정과 보호를 포함한 통합 시험은 완료되지 않았다. Stage C는 초기 3 kW 스위칭 수준 ODE 모델에서 공진점 이득과 양방향 동작 가능성을 검토했지만, 최신 요구는 약 5 kW급이므로 기존 3 kW 결과를 5 kW 설계의 성능 근거로 사용할 수 없다.</w:t>
+        <w:t xml:space="preserve">정상 조건의 예로 648 V, 비지연 부하 25 A에서는 PTC 히터 17.5 A와 배터리 히터 16.875 A를 승인하고 48 V 저우선 부하는 보류한다. 이 승인은 정적 예산 기준이며 전압 안전성을 검증한 결과가 아니다.</w:t>
       </w:r>
     </w:p>
     <w:p>
@@ -14639,7 +14390,7 @@
         <w:jc w:val="both"/>
       </w:pPr>
       <w:r>
-        <w:t xml:space="preserve">Stage B의 DAB 입력전력, 유한 링크의 저장에너지와 방향별 효율을 반영한 에너지 보존 평균모델을 구축하고, 보조버스 부하전류·경로·필터 전류·링크전류·전류지령·링크전력을 분리해 포트별 정격을 판정할 수 있게 했다.</w:t>
+        <w:t xml:space="preserve">Stage B의 DAB 입력전력, 유한 링크 저장에너지와 방향별 효율을 반영한 에너지 보존 평균모델과 포트별 정격 판정 체계를 구축했다.</w:t>
       </w:r>
     </w:p>
     <w:p>
@@ -14653,7 +14404,7 @@
         <w:jc w:val="both"/>
       </w:pPr>
       <w:r>
-        <w:t xml:space="preserve">25 kW 보조버스에서 Stage B 처리전력이 최대 6.44 kW(25.7 %)이고 충전전류가 조정단을 지나지 않음을 평균모델 수준에서 확인했다(가설 H1의 부분 근거).</w:t>
+        <w:t xml:space="preserve">25 kW 보조버스에서 Stage B 처리전력이 최대 6.44 kW(25.7 %)이고 충전전류가 조정단을 지나지 않음을 평균모델에서 확인했다(가설 H1의 부분 근거).</w:t>
       </w:r>
     </w:p>
     <w:p>
@@ -14667,7 +14418,7 @@
         <w:jc w:val="both"/>
       </w:pPr>
       <w:r>
-        <w:t xml:space="preserve">평균 H-브리지 모델에서 양·음 직렬전압과 0 V 통과를 확인하고, 부하 증가·제거와 회생 조건을 하나의 시험체계에 포함했다.</w:t>
+        <w:t xml:space="preserve">하나의 고정 제어이득으로 공칭 지연 조건의 정상시험 41건(회생·0 V 통과 포함)과 단일 변수 공차시험 28건을 통과했고, 640 V 코너 여유·지연 실패 양상·전압별 과도 허용 전력을 정량화해 재설계 목표를 정했다.</w:t>
       </w:r>
     </w:p>
     <w:p>
@@ -14681,7 +14432,7 @@
         <w:jc w:val="both"/>
       </w:pPr>
       <w:r>
-        <w:t xml:space="preserve">운전점별 이득 재계산을 제거한 공통 고정이득 후보로 공칭 지연 조건의 정상시험 41건과 단일 변수 공차시험 28건을 통과했다.</w:t>
+        <w:t xml:space="preserve">Stage A 스위칭 ODE 모델에서 위상별 자기발진 영교차 추종으로 정·역방향 공차 표본의 ZCS를 확보했다.</w:t>
       </w:r>
     </w:p>
     <w:p>
@@ -14695,35 +14446,7 @@
         <w:jc w:val="both"/>
       </w:pPr>
       <w:r>
-        <w:t xml:space="preserve">640 V 코너의 포트별 여유, 지연 실패 양상의 구분, 배터리 전압별 과도 허용 전력을 정량화해 재설계 목표와 부하 승인의 근거를 확보했다.</w:t>
-      </w:r>
-    </w:p>
-    <w:p>
-      <w:pPr>
-        <w:pStyle w:val="ListParagraph"/>
-        <w:numPr>
-          <w:ilvl w:val="0"/>
-          <w:numId w:val="2"/>
-        </w:numPr>
-        <w:spacing w:after="60"/>
-        <w:jc w:val="both"/>
-      </w:pPr>
-      <w:r>
-        <w:t xml:space="preserve">Stage A 스위칭 ODE 모델에서 위상별 자기발진 영교차 추종으로 정·역방향 공차 표본의 ZCS를 확보했다.</w:t>
-      </w:r>
-    </w:p>
-    <w:p>
-      <w:pPr>
-        <w:pStyle w:val="ListParagraph"/>
-        <w:numPr>
-          <w:ilvl w:val="0"/>
-          <w:numId w:val="2"/>
-        </w:numPr>
-        <w:spacing w:after="60"/>
-        <w:jc w:val="both"/>
-      </w:pPr>
-      <w:r>
-        <w:t xml:space="preserve">과부하, 제어 여유 제거, 추가 전달지연과 SALS 관측 전 사건을 실패 회귀시험으로 보존하고, Python과 MATLAB의 별도 구현으로 시험조건과 판정의 재현성을 확인했다.</w:t>
+        <w:t xml:space="preserve">실패 조건(과부하, 제어 여유 제거, 추가 지연, SALS 관측 전 사건)을 회귀시험으로 보존하고, Python·MATLAB 별도 구현으로 판정 재현성을 확인했다.</w:t>
       </w:r>
     </w:p>
     <w:p>
@@ -15929,7 +15652,7 @@
                 <w:sz w:val="16"/>
                 <w:szCs w:val="16"/>
               </w:rPr>
-              <w:t xml:space="preserve">미충족(경로 98.0 A, 지연 여유 +1.2 µs)</w:t>
+              <w:t xml:space="preserve">미충족(경로 98.0 A, 전 기준 통과 지연 여유 +1.2 µs)</w:t>
             </w:r>
           </w:p>
         </w:tc>
@@ -17298,7 +17021,7 @@
         <w:jc w:val="both"/>
       </w:pPr>
       <w:r>
-        <w:t xml:space="preserve">PRISM-Hub는 800 V 차량의 충전 호환과 다중 전압 보조전원을 하나의 직류 전력 구조에서 다루기 위해 고정비 대전력 경로와 부분전력 직렬 조정을 결합한 아키텍처다. 이 아이디어는 전전력 변환기의 높은 정격 부담과 고정비 변환기의 전압조정 한계 사이에서 도출되었다. 고정비 RSC/STC, 부분전력 조정, 양극성 직렬 보상, 통합 보조전원과 차량 부하 관리는 각각 선행연구와 특허가 존재하므로, 프로젝트의 가치는 개별 원리의 최초성보다 이 원리들을 800 V 차량의 주행·충전·보조전원 조건에 배치하고 포트 정격과 실패 경계를 재현 가능한 체계에서 정량화하는 데 있다.</w:t>
+        <w:t xml:space="preserve">PRISM-Hub는 고정비 대전력 경로와 부분전력 직렬 조정을 결합해 800 V 차량의 충전 호환과 다중 전압 보조전원을 하나의 직류 전력 구조로 다루는 아키텍처다. 개별 원리에는 선행연구와 특허가 있으므로, 프로젝트의 가치는 이 원리들을 차량 운전조건에 배치하고 포트 정격과 실패 경계를 재현 가능한 체계에서 정량화하는 데 있다.</w:t>
       </w:r>
     </w:p>
     <w:p>
@@ -20061,7 +19784,7 @@
         <w:sz w:val="16"/>
         <w:szCs w:val="16"/>
       </w:rPr>
-      <w:t xml:space="preserve">PRISM-Hub 중간 연구 진행 보고서 · v1.0</w:t>
+      <w:t xml:space="preserve">PRISM-Hub 중간 연구 진행 보고서 · v1.1</w:t>
     </w:r>
   </w:p>
 </w:hdr>

</xml_diff>

<commit_message>
feat: submission verification code package (E1-E10) and report alignment
- submission/verification_code: MATLAB/Python code reorganised by the
  report's evidence IDs (E1-E10), Korean headers (purpose, rationale,
  method, criteria, how to run, report values) and Korean comments.
  Re-run reproduces every number quoted in the report.
- Stage A Python model now uses MATLAB rounding and the MATLAB Mersenne
  Twister stream, so tolerance samples and results match MATLAB R2024b
  bit for bit.
- Report: add E10 (Stage C 3 kW CLLC switching ODE) to Appendix C,
  state Stage C result as resonant gain 1 +/- 0.3 % and ZVS margin
  >= 3.7x (bidirectional moved to next steps), V_g,dynamic 622.2 V and
  degraded static limit 613.1 V, fix label overlaps in figures 3 and 11.

Co-Authored-By: Claude Opus 5.5 <noreply@anthropic.com>
Claude-Session: https://claude.ai/code/session_01Qz3Pq1XT4GoX9UD7qvXAd4
</commit_message>
<xml_diff>
--- a/docs/13_PRISM-Hub_중간보고서_최종본.docx
+++ b/docs/13_PRISM-Hub_중간보고서_최종본.docx
@@ -451,7 +451,7 @@
                 <w:sz w:val="19"/>
                 <w:szCs w:val="19"/>
               </w:rPr>
-              <w:t xml:space="preserve">본문의 수치는 부록 C의 검증 근거(E1–E9)에 따른 해석과 시뮬레이션 결과다.</w:t>
+              <w:t xml:space="preserve">본문의 수치는 부록 C의 검증 근거(E1–E10)에 따른 해석과 시뮬레이션 결과다.</w:t>
             </w:r>
           </w:p>
         </w:tc>
@@ -4986,7 +4986,7 @@
         <w:jc w:val="both"/>
       </w:pPr>
       <w:r>
-        <w:t xml:space="preserve">보장 최소 배터리 전압은 링크전압이 대역 하한 90 V이고 경로저항이 10 % 큰 최악 조건에서 25 kW 정상점이 성립하는 631.7 V에 약 8 V 여유를 더해 640 V로 정했다. 동특성 시험(Tier-1)은 이보다 낮은 622.3 V까지 통과하므로 정적 조건이 결정 조건이다. 614–640 V는 버스 기준을 390 V까지 낮추는 저하 운전 영역(정적 한계 613.2 V, Tier-2 최대 강하를 더해도 384 V 이상)이고, 614 V 미만은 보장 범위 밖으로 두어 차량 수준의 배터리 하한 보호로 진입을 막는다.</w:t>
+        <w:t xml:space="preserve">보장 최소 배터리 전압은 링크전압이 대역 하한 90 V이고 경로저항이 10 % 큰 최악 조건에서 25 kW 정상점이 성립하는 631.7 V에 약 8 V 여유를 더해 640 V로 정했다. 동특성 시험(Tier-1)은 이보다 낮은 622.2 V까지 통과하므로 정적 조건이 결정 조건이다. 614–640 V는 버스 기준을 390 V까지 낮추는 저하 운전 영역(정적 한계 613.2 V, Tier-2 최대 강하를 더해도 384 V 이상)이고, 614 V 미만은 보장 범위 밖으로 두어 차량 수준의 배터리 하한 보호로 진입을 막는다.</w:t>
       </w:r>
     </w:p>
     <w:p>
@@ -15767,7 +15767,7 @@
                 <w:sz w:val="15"/>
                 <w:szCs w:val="15"/>
               </w:rPr>
-              <w:t xml:space="preserve">공진점 이득·양방향 확인</w:t>
+              <w:t xml:space="preserve">공진점 이득 1 ± 0.3 %(0.3–3 kW), ZVS 여유 3.7배 이상</w:t>
             </w:r>
           </w:p>
         </w:tc>
@@ -15792,7 +15792,7 @@
                 <w:sz w:val="15"/>
                 <w:szCs w:val="15"/>
               </w:rPr>
-              <w:t xml:space="preserve">5 kW 재설계</w:t>
+              <w:t xml:space="preserve">5 kW 재설계, 양방향 운전</w:t>
             </w:r>
           </w:p>
         </w:tc>
@@ -20578,7 +20578,7 @@
         <w:jc w:val="both"/>
       </w:pPr>
       <w:r>
-        <w:t xml:space="preserve">본문의 수치는 다음 검증 근거에서 얻었다. 각 근거는 입력 조건, 판정 기준과 결과를 함께 보관하며 동일 조건에서 재현할 수 있다.</w:t>
+        <w:t xml:space="preserve">본문의 수치는 다음 검증 근거에서 얻었다. 각 근거는 입력 조건, 판정 기준과 결과를 함께 보관하며 동일 조건에서 재현할 수 있다. 근거별 계산 코드와 실행 방법은 같은 번호 체계로 정리한 검증 코드 묶음(MATLAB, Python)에 수록했다.</w:t>
       </w:r>
     </w:p>
     <w:p>
@@ -21669,6 +21669,111 @@
                 <w:szCs w:val="16"/>
               </w:rPr>
               <w:t xml:space="preserve">Python</w:t>
+            </w:r>
+          </w:p>
+        </w:tc>
+      </w:tr>
+      <w:tr>
+        <w:trPr>
+          <w:cantSplit/>
+        </w:trPr>
+        <w:tc>
+          <w:tcPr>
+            <w:tcW w:type="dxa" w:w="712"/>
+            <w:tcMar>
+              <w:top w:type="dxa" w:w="50"/>
+              <w:left w:type="dxa" w:w="90"/>
+              <w:bottom w:type="dxa" w:w="50"/>
+              <w:right w:type="dxa" w:w="90"/>
+            </w:tcMar>
+            <w:vAlign w:val="center"/>
+          </w:tcPr>
+          <w:p>
+            <w:pPr>
+              <w:spacing w:after="0" w:before="0" w:line="260"/>
+              <w:jc w:val="left"/>
+            </w:pPr>
+            <w:r>
+              <w:rPr>
+                <w:sz w:val="16"/>
+                <w:szCs w:val="16"/>
+              </w:rPr>
+              <w:t xml:space="preserve">E10</w:t>
+            </w:r>
+          </w:p>
+        </w:tc>
+        <w:tc>
+          <w:tcPr>
+            <w:tcW w:type="dxa" w:w="3167"/>
+            <w:tcMar>
+              <w:top w:type="dxa" w:w="50"/>
+              <w:left w:type="dxa" w:w="90"/>
+              <w:bottom w:type="dxa" w:w="50"/>
+              <w:right w:type="dxa" w:w="90"/>
+            </w:tcMar>
+            <w:vAlign w:val="center"/>
+          </w:tcPr>
+          <w:p>
+            <w:pPr>
+              <w:spacing w:after="0" w:before="0" w:line="260"/>
+              <w:jc w:val="left"/>
+            </w:pPr>
+            <w:r>
+              <w:rPr>
+                <w:sz w:val="16"/>
+                <w:szCs w:val="16"/>
+              </w:rPr>
+              <w:t xml:space="preserve">Stage C 스위칭 ODE 시험</w:t>
+            </w:r>
+          </w:p>
+        </w:tc>
+        <w:tc>
+          <w:tcPr>
+            <w:tcW w:type="dxa" w:w="3642"/>
+            <w:tcMar>
+              <w:top w:type="dxa" w:w="50"/>
+              <w:left w:type="dxa" w:w="90"/>
+              <w:bottom w:type="dxa" w:w="50"/>
+              <w:right w:type="dxa" w:w="90"/>
+            </w:tcMar>
+            <w:vAlign w:val="center"/>
+          </w:tcPr>
+          <w:p>
+            <w:pPr>
+              <w:spacing w:after="0" w:before="0" w:line="260"/>
+              <w:jc w:val="left"/>
+            </w:pPr>
+            <w:r>
+              <w:rPr>
+                <w:sz w:val="16"/>
+                <w:szCs w:val="16"/>
+              </w:rPr>
+              <w:t xml:space="preserve">3 kW CLLC 후보 설계의 전압이득(0.3–3 kW, 스위칭주파수/공진주파수 0.9–1.1, 기본파 근사 대조), 입력 ±2 %, ZVS 여유</w:t>
+            </w:r>
+          </w:p>
+        </w:tc>
+        <w:tc>
+          <w:tcPr>
+            <w:tcW w:type="dxa" w:w="1505"/>
+            <w:tcMar>
+              <w:top w:type="dxa" w:w="50"/>
+              <w:left w:type="dxa" w:w="90"/>
+              <w:bottom w:type="dxa" w:w="50"/>
+              <w:right w:type="dxa" w:w="90"/>
+            </w:tcMar>
+            <w:vAlign w:val="center"/>
+          </w:tcPr>
+          <w:p>
+            <w:pPr>
+              <w:spacing w:after="0" w:before="0" w:line="260"/>
+              <w:jc w:val="left"/>
+            </w:pPr>
+            <w:r>
+              <w:rPr>
+                <w:sz w:val="16"/>
+                <w:szCs w:val="16"/>
+              </w:rPr>
+              <w:t xml:space="preserve">MATLAB, Python</w:t>
             </w:r>
           </w:p>
         </w:tc>

</xml_diff>